<commit_message>
Focus site on three history routes
</commit_message>
<xml_diff>
--- a/exports/docx/current_status_ja.docx
+++ b/exports/docx/current_status_ja.docx
@@ -25,7 +25,7 @@
         <w:t xml:space="preserve">更新日:</w:t>
       </w:r>
       <w:r>
-        <w:t xml:space="preserve"> 2026-05-08</w:t>
+        <w:t xml:space="preserve"> 2026-05-09</w:t>
       </w:r>
     </w:p>
     <w:bookmarkStart w:id="9" w:name="現在の状態"/>
@@ -383,6 +383,57 @@
         <w:t xml:space="preserve">直近で、サイト文言を「論争」ではなく「面白い筋から入る歴史読み物」へ修正。</w:t>
       </w:r>
     </w:p>
+    <w:p>
+      <w:pPr>
+        <w:pStyle w:val="Compact"/>
+        <w:numPr>
+          <w:ilvl w:val="0"/>
+          <w:numId w:val="1002"/>
+        </w:numPr>
+      </w:pPr>
+      <w:r>
+        <w:rPr>
+          <w:rFonts w:hint="eastAsia"/>
+        </w:rPr>
+        <w:t xml:space="preserve">公開カテゴリを</w:t>
+      </w:r>
+      <w:r>
+        <w:t xml:space="preserve"> </w:t>
+      </w:r>
+      <w:r>
+        <w:rPr>
+          <w:rStyle w:val="VerbatimChar"/>
+        </w:rPr>
+        <w:t xml:space="preserve">Sengoku</w:t>
+      </w:r>
+      <w:r>
+        <w:t xml:space="preserve">、</w:t>
+      </w:r>
+      <w:r>
+        <w:rPr>
+          <w:rStyle w:val="VerbatimChar"/>
+        </w:rPr>
+        <w:t xml:space="preserve">Bakumatsu</w:t>
+      </w:r>
+      <w:r>
+        <w:t xml:space="preserve">、</w:t>
+      </w:r>
+      <w:r>
+        <w:rPr>
+          <w:rStyle w:val="VerbatimChar"/>
+        </w:rPr>
+        <w:t xml:space="preserve">Hidden Places</w:t>
+      </w:r>
+      <w:r>
+        <w:t xml:space="preserve"> </w:t>
+      </w:r>
+      <w:r>
+        <w:rPr>
+          <w:rFonts w:hint="eastAsia"/>
+        </w:rPr>
+        <w:t xml:space="preserve">の3つに絞る方針へ変更。</w:t>
+      </w:r>
+    </w:p>
     <w:bookmarkEnd w:id="10"/>
     <w:bookmarkStart w:id="11" w:name="直近の編集方針"/>
     <w:p>
@@ -505,9 +556,27 @@
       </w:pPr>
       <w:r>
         <w:rPr>
-          <w:rFonts w:hint="eastAsia"/>
-        </w:rPr>
-        <w:t xml:space="preserve">1本目の記事の日本語版・ドイツ語版も、英語版と同じ読み物調へ揃える。</w:t>
+          <w:rStyle w:val="VerbatimChar"/>
+        </w:rPr>
+        <w:t xml:space="preserve">task/affiliate_partner_application_steps_ja.md</w:t>
+      </w:r>
+      <w:r>
+        <w:t xml:space="preserve"> </w:t>
+      </w:r>
+      <w:r>
+        <w:rPr>
+          <w:rFonts w:hint="eastAsia"/>
+        </w:rPr>
+        <w:t xml:space="preserve">を見ながら、Booking.com、GetYourGuide、Klook、Amazon</w:t>
+      </w:r>
+      <w:r>
+        <w:t xml:space="preserve"> Associates </w:t>
+      </w:r>
+      <w:r>
+        <w:rPr>
+          <w:rFonts w:hint="eastAsia"/>
+        </w:rPr>
+        <w:t xml:space="preserve">に申請する。</w:t>
       </w:r>
     </w:p>
     <w:p>
@@ -522,67 +591,25 @@
         <w:rPr>
           <w:rFonts w:hint="eastAsia"/>
         </w:rPr>
-        <w:t xml:space="preserve">1本目の記事に内部リンク予定地を追加する。</w:t>
-      </w:r>
-    </w:p>
-    <w:p>
-      <w:pPr>
-        <w:pStyle w:val="Compact"/>
-        <w:numPr>
-          <w:ilvl w:val="1"/>
-          <w:numId w:val="1005"/>
-        </w:numPr>
-      </w:pPr>
-      <w:r>
-        <w:t xml:space="preserve">Himiko / Yamatai</w:t>
-      </w:r>
-    </w:p>
-    <w:p>
-      <w:pPr>
-        <w:pStyle w:val="Compact"/>
-        <w:numPr>
-          <w:ilvl w:val="1"/>
-          <w:numId w:val="1005"/>
-        </w:numPr>
-      </w:pPr>
-      <w:r>
-        <w:t xml:space="preserve">Kofun</w:t>
-      </w:r>
-    </w:p>
-    <w:p>
-      <w:pPr>
-        <w:pStyle w:val="Compact"/>
-        <w:numPr>
-          <w:ilvl w:val="1"/>
-          <w:numId w:val="1005"/>
-        </w:numPr>
-      </w:pPr>
-      <w:r>
-        <w:t xml:space="preserve">Buddhism and Soga</w:t>
-      </w:r>
-    </w:p>
-    <w:p>
-      <w:pPr>
-        <w:pStyle w:val="Compact"/>
-        <w:numPr>
-          <w:ilvl w:val="1"/>
-          <w:numId w:val="1005"/>
-        </w:numPr>
-      </w:pPr>
-      <w:r>
-        <w:t xml:space="preserve">Nara to Heian</w:t>
-      </w:r>
-    </w:p>
-    <w:p>
-      <w:pPr>
-        <w:pStyle w:val="Compact"/>
-        <w:numPr>
-          <w:ilvl w:val="1"/>
-          <w:numId w:val="1005"/>
-        </w:numPr>
-      </w:pPr>
-      <w:r>
-        <w:t xml:space="preserve">Rise of samurai</w:t>
+        <w:t xml:space="preserve">発行されたIDを</w:t>
+      </w:r>
+      <w:r>
+        <w:t xml:space="preserve"> </w:t>
+      </w:r>
+      <w:r>
+        <w:rPr>
+          <w:rStyle w:val="VerbatimChar"/>
+        </w:rPr>
+        <w:t xml:space="preserve">task/affiliate_link_inventory_ja.md</w:t>
+      </w:r>
+      <w:r>
+        <w:t xml:space="preserve"> </w:t>
+      </w:r>
+      <w:r>
+        <w:rPr>
+          <w:rFonts w:hint="eastAsia"/>
+        </w:rPr>
+        <w:t xml:space="preserve">に記録する。</w:t>
       </w:r>
     </w:p>
     <w:p>
@@ -595,18 +622,27 @@
       </w:pPr>
       <w:r>
         <w:rPr>
-          <w:rStyle w:val="VerbatimChar"/>
-        </w:rPr>
-        <w:t xml:space="preserve">Origins to Heian</w:t>
-      </w:r>
-      <w:r>
-        <w:t xml:space="preserve"> </w:t>
-      </w:r>
-      <w:r>
-        <w:rPr>
-          <w:rFonts w:hint="eastAsia"/>
-        </w:rPr>
-        <w:t xml:space="preserve">の個別記事を1本選んで作る。</w:t>
+          <w:rFonts w:hint="eastAsia"/>
+        </w:rPr>
+        <w:t xml:space="preserve">アフィリエイトID発行後、</w:t>
+      </w:r>
+      <w:r>
+        <w:rPr>
+          <w:rStyle w:val="VerbatimChar"/>
+        </w:rPr>
+        <w:t xml:space="preserve">site/src/data/monetization.ts</w:t>
+      </w:r>
+      <w:r>
+        <w:t xml:space="preserve"> </w:t>
+      </w:r>
+      <w:r>
+        <w:t xml:space="preserve">または Cloudflare </w:t>
+      </w:r>
+      <w:r>
+        <w:rPr>
+          <w:rFonts w:hint="eastAsia"/>
+        </w:rPr>
+        <w:t xml:space="preserve">の環境変数に反映する。</w:t>
       </w:r>
     </w:p>
     <w:p>
@@ -621,6 +657,48 @@
         <w:rPr>
           <w:rStyle w:val="VerbatimChar"/>
         </w:rPr>
+        <w:t xml:space="preserve">Sengoku</w:t>
+      </w:r>
+      <w:r>
+        <w:t xml:space="preserve">、</w:t>
+      </w:r>
+      <w:r>
+        <w:rPr>
+          <w:rStyle w:val="VerbatimChar"/>
+        </w:rPr>
+        <w:t xml:space="preserve">Bakumatsu</w:t>
+      </w:r>
+      <w:r>
+        <w:t xml:space="preserve">、</w:t>
+      </w:r>
+      <w:r>
+        <w:rPr>
+          <w:rStyle w:val="VerbatimChar"/>
+        </w:rPr>
+        <w:t xml:space="preserve">Hidden Places</w:t>
+      </w:r>
+      <w:r>
+        <w:t xml:space="preserve"> </w:t>
+      </w:r>
+      <w:r>
+        <w:rPr>
+          <w:rFonts w:hint="eastAsia"/>
+        </w:rPr>
+        <w:t xml:space="preserve">の3カテゴリで、記事候補と内部リンクを整理する。</w:t>
+      </w:r>
+    </w:p>
+    <w:p>
+      <w:pPr>
+        <w:pStyle w:val="Compact"/>
+        <w:numPr>
+          <w:ilvl w:val="0"/>
+          <w:numId w:val="1004"/>
+        </w:numPr>
+      </w:pPr>
+      <w:r>
+        <w:rPr>
+          <w:rStyle w:val="VerbatimChar"/>
+        </w:rPr>
         <w:t xml:space="preserve">Hidden Japan Travel</w:t>
       </w:r>
       <w:r>
@@ -645,7 +723,7 @@
         <w:rPr>
           <w:rFonts w:hint="eastAsia"/>
         </w:rPr>
-        <w:t xml:space="preserve">旅行アフィリエイトの本登録・リンク置換を進める。</w:t>
+        <w:t xml:space="preserve">既存の古代記事は、当面「背景記事」として残し、主導線からは外す。</w:t>
       </w:r>
     </w:p>
     <w:bookmarkEnd w:id="12"/>
@@ -666,7 +744,7 @@
         <w:pStyle w:val="Compact"/>
         <w:numPr>
           <w:ilvl w:val="0"/>
-          <w:numId w:val="1006"/>
+          <w:numId w:val="1005"/>
         </w:numPr>
       </w:pPr>
       <w:r>
@@ -690,31 +768,31 @@
         <w:pStyle w:val="Compact"/>
         <w:numPr>
           <w:ilvl w:val="0"/>
-          <w:numId w:val="1006"/>
-        </w:numPr>
-      </w:pPr>
-      <w:r>
-        <w:rPr>
-          <w:rFonts w:hint="eastAsia"/>
-        </w:rPr>
-        <w:t xml:space="preserve">原始〜平安シリーズ:</w:t>
-      </w:r>
-      <w:r>
-        <w:t xml:space="preserve"> </w:t>
-      </w:r>
-      <w:r>
-        <w:rPr>
-          <w:rStyle w:val="VerbatimChar"/>
-        </w:rPr>
-        <w:t xml:space="preserve">article-workspace/origins-to-heian/README.md</w:t>
-      </w:r>
-    </w:p>
-    <w:p>
-      <w:pPr>
-        <w:pStyle w:val="Compact"/>
-        <w:numPr>
-          <w:ilvl w:val="0"/>
-          <w:numId w:val="1006"/>
+          <w:numId w:val="1005"/>
+        </w:numPr>
+      </w:pPr>
+      <w:r>
+        <w:rPr>
+          <w:rFonts w:hint="eastAsia"/>
+        </w:rPr>
+        <w:t xml:space="preserve">3カテゴリ方針:</w:t>
+      </w:r>
+      <w:r>
+        <w:t xml:space="preserve"> </w:t>
+      </w:r>
+      <w:r>
+        <w:rPr>
+          <w:rStyle w:val="VerbatimChar"/>
+        </w:rPr>
+        <w:t xml:space="preserve">site/src/copy/siteTemplate.ts</w:t>
+      </w:r>
+    </w:p>
+    <w:p>
+      <w:pPr>
+        <w:pStyle w:val="Compact"/>
+        <w:numPr>
+          <w:ilvl w:val="0"/>
+          <w:numId w:val="1005"/>
         </w:numPr>
       </w:pPr>
       <w:r>
@@ -738,7 +816,7 @@
         <w:pStyle w:val="Compact"/>
         <w:numPr>
           <w:ilvl w:val="0"/>
-          <w:numId w:val="1006"/>
+          <w:numId w:val="1005"/>
         </w:numPr>
       </w:pPr>
       <w:r>
@@ -762,7 +840,7 @@
         <w:pStyle w:val="Compact"/>
         <w:numPr>
           <w:ilvl w:val="0"/>
-          <w:numId w:val="1006"/>
+          <w:numId w:val="1005"/>
         </w:numPr>
       </w:pPr>
       <w:r>
@@ -786,7 +864,55 @@
         <w:pStyle w:val="Compact"/>
         <w:numPr>
           <w:ilvl w:val="0"/>
-          <w:numId w:val="1006"/>
+          <w:numId w:val="1005"/>
+        </w:numPr>
+      </w:pPr>
+      <w:r>
+        <w:rPr>
+          <w:rFonts w:hint="eastAsia"/>
+        </w:rPr>
+        <w:t xml:space="preserve">アフィリエイト登録手順:</w:t>
+      </w:r>
+      <w:r>
+        <w:t xml:space="preserve"> </w:t>
+      </w:r>
+      <w:r>
+        <w:rPr>
+          <w:rStyle w:val="VerbatimChar"/>
+        </w:rPr>
+        <w:t xml:space="preserve">task/affiliate_partner_application_steps_ja.md</w:t>
+      </w:r>
+    </w:p>
+    <w:p>
+      <w:pPr>
+        <w:pStyle w:val="Compact"/>
+        <w:numPr>
+          <w:ilvl w:val="0"/>
+          <w:numId w:val="1005"/>
+        </w:numPr>
+      </w:pPr>
+      <w:r>
+        <w:rPr>
+          <w:rFonts w:hint="eastAsia"/>
+        </w:rPr>
+        <w:t xml:space="preserve">アフィリエイトID台帳:</w:t>
+      </w:r>
+      <w:r>
+        <w:t xml:space="preserve"> </w:t>
+      </w:r>
+      <w:r>
+        <w:rPr>
+          <w:rStyle w:val="VerbatimChar"/>
+        </w:rPr>
+        <w:t xml:space="preserve">task/affiliate_link_inventory_ja.md</w:t>
+      </w:r>
+    </w:p>
+    <w:p>
+      <w:pPr>
+        <w:pStyle w:val="Compact"/>
+        <w:numPr>
+          <w:ilvl w:val="0"/>
+          <w:numId w:val="1005"/>
         </w:numPr>
       </w:pPr>
       <w:r>
@@ -823,7 +949,7 @@
         <w:pStyle w:val="Compact"/>
         <w:numPr>
           <w:ilvl w:val="0"/>
-          <w:numId w:val="1007"/>
+          <w:numId w:val="1006"/>
         </w:numPr>
       </w:pPr>
       <w:r>
@@ -838,7 +964,7 @@
         <w:pStyle w:val="Compact"/>
         <w:numPr>
           <w:ilvl w:val="0"/>
-          <w:numId w:val="1007"/>
+          <w:numId w:val="1006"/>
         </w:numPr>
       </w:pPr>
       <w:r>
@@ -862,7 +988,7 @@
         <w:pStyle w:val="Compact"/>
         <w:numPr>
           <w:ilvl w:val="0"/>
-          <w:numId w:val="1007"/>
+          <w:numId w:val="1006"/>
         </w:numPr>
       </w:pPr>
       <w:r>
@@ -1227,9 +1353,6 @@
     <w:abstractNumId w:val="991"/>
   </w:num>
   <w:num w:numId="1006">
-    <w:abstractNumId w:val="991"/>
-  </w:num>
-  <w:num w:numId="1007">
     <w:abstractNumId w:val="991"/>
   </w:num>
 </w:numbering>

</xml_diff>